<commit_message>
fix(thesis): include P1 in golden-thread table and kappa (complete P1–P10 + meta + book chapter)
Per review, the integrative artefacts must cover every component. Add the
foundational study P1 (17-economy Asian baseline, N=40,633; digital-shield
interaction +0.110, p<.001) as the leading row of Bảng 5.1 and of the kappa's
Table 1, and correct the synthesis counts to the full set: P1–P10 + meta (P6) +
book chapter. Number from §5.6.1; no value changed elsewhere.

Rebuild package (full dissertation 158pp) + kappa docx/pdf.

Co-Authored-By: Claude Opus 4.8 (1M context) <noreply@anthropic.com>
Claude-Session: https://claude.ai/code/session_01Xumaoraa2DLWLXsgJJ62oq
</commit_message>
<xml_diff>
--- a/dist/BO_NOP_HOAN_CHINH_2026-06/3_luan_an_chuong_phu_luc/chuong_5_ket_luan_de_xuat_vi.docx
+++ b/dist/BO_NOP_HOAN_CHINH_2026-06/3_luan_an_chuong_phu_luc/chuong_5_ket_luan_de_xuat_vi.docx
@@ -1773,6 +1773,171 @@
               <w:jc w:val="left"/>
             </w:pPr>
             <w:r>
+              <w:t xml:space="preserve">Cơ sở</w:t>
+            </w:r>
+          </w:p>
+        </w:tc>
+        <w:tc>
+          <w:tcPr/>
+          <w:p>
+            <w:pPr>
+              <w:pStyle w:val="Compact"/>
+              <w:jc w:val="left"/>
+            </w:pPr>
+            <w:r>
+              <w:t xml:space="preserve">P1 — Cơ sở đa quốc gia 17 nền (</w:t>
+            </w:r>
+            <m:oMath>
+              <m:r>
+                <m:t>N</m:t>
+              </m:r>
+              <m:r>
+                <m:rPr>
+                  <m:sty m:val="p"/>
+                </m:rPr>
+                <m:t>=</m:t>
+              </m:r>
+              <m:r>
+                <m:t>40.633</m:t>
+              </m:r>
+            </m:oMath>
+            <w:r>
+              <w:t xml:space="preserve">)</w:t>
+            </w:r>
+          </w:p>
+        </w:tc>
+        <w:tc>
+          <w:tcPr/>
+          <w:p>
+            <w:pPr>
+              <w:pStyle w:val="Compact"/>
+              <w:jc w:val="left"/>
+            </w:pPr>
+            <w:r>
+              <w:t xml:space="preserve">Nền tảng (CDCM)</w:t>
+            </w:r>
+          </w:p>
+        </w:tc>
+        <w:tc>
+          <w:tcPr/>
+          <w:p>
+            <w:pPr>
+              <w:pStyle w:val="Compact"/>
+              <w:jc w:val="left"/>
+            </w:pPr>
+            <w:r>
+              <w:t xml:space="preserve">Phân tầng năng suất theo vùng;</w:t>
+            </w:r>
+            <w:r>
+              <w:t xml:space="preserve"> </w:t>
+            </w:r>
+            <w:r>
+              <w:rPr>
+                <w:bCs/>
+                <w:b/>
+              </w:rPr>
+              <w:t xml:space="preserve">hiệu ứng lá chắn số</w:t>
+            </w:r>
+            <w:r>
+              <w:t xml:space="preserve"> </w:t>
+            </w:r>
+            <w:r>
+              <w:t xml:space="preserve">(rào cản × công nghệ</w:t>
+            </w:r>
+            <w:r>
+              <w:t xml:space="preserve"> </w:t>
+            </w:r>
+            <m:oMath>
+              <m:r>
+                <m:rPr>
+                  <m:sty m:val="p"/>
+                </m:rPr>
+                <m:t>+</m:t>
+              </m:r>
+              <m:r>
+                <m:t>0</m:t>
+              </m:r>
+              <m:r>
+                <m:rPr>
+                  <m:sty m:val="p"/>
+                </m:rPr>
+                <m:t>,</m:t>
+              </m:r>
+              <m:r>
+                <m:t>110</m:t>
+              </m:r>
+            </m:oMath>
+            <w:r>
+              <w:t xml:space="preserve">,</w:t>
+            </w:r>
+            <w:r>
+              <w:t xml:space="preserve"> </w:t>
+            </w:r>
+            <m:oMath>
+              <m:r>
+                <m:t>p</m:t>
+              </m:r>
+              <m:r>
+                <m:rPr>
+                  <m:sty m:val="p"/>
+                </m:rPr>
+                <m:t>&lt;</m:t>
+              </m:r>
+              <m:r>
+                <m:rPr>
+                  <m:sty m:val="p"/>
+                </m:rPr>
+                <m:t>,</m:t>
+              </m:r>
+              <m:r>
+                <m:t>001</m:t>
+              </m:r>
+            </m:oMath>
+            <w:r>
+              <w:t xml:space="preserve">)</w:t>
+            </w:r>
+          </w:p>
+        </w:tc>
+        <w:tc>
+          <w:tcPr/>
+          <w:p>
+            <w:pPr>
+              <w:pStyle w:val="Compact"/>
+              <w:jc w:val="left"/>
+            </w:pPr>
+            <w:r>
+              <w:t xml:space="preserve">Đặt nền cho khung CDCM; nguồn gốc</w:t>
+            </w:r>
+            <w:r>
+              <w:t xml:space="preserve"> </w:t>
+            </w:r>
+            <w:r>
+              <w:t xml:space="preserve">“</w:t>
+            </w:r>
+            <w:r>
+              <w:t xml:space="preserve">lá chắn số</w:t>
+            </w:r>
+            <w:r>
+              <w:t xml:space="preserve">”</w:t>
+            </w:r>
+            <w:r>
+              <w:t xml:space="preserve"> </w:t>
+            </w:r>
+            <w:r>
+              <w:t xml:space="preserve">mà P7 mở rộng ra 50 nền</w:t>
+            </w:r>
+          </w:p>
+        </w:tc>
+      </w:tr>
+      <w:tr>
+        <w:tc>
+          <w:tcPr/>
+          <w:p>
+            <w:pPr>
+              <w:pStyle w:val="Compact"/>
+              <w:jc w:val="left"/>
+            </w:pPr>
+            <w:r>
               <w:t xml:space="preserve">RQ1</w:t>
             </w:r>
           </w:p>
@@ -3175,7 +3340,7 @@
         <w:pStyle w:val="BodyText"/>
       </w:pPr>
       <w:r>
-        <w:t xml:space="preserve">Đọc dọc Bảng 5.1, chín mảnh bằng chứng độc lập — một phân tích tổng hợp toàn cầu, năm ước lượng đơn quốc gia trải khắp phổ thể chế, một kiểm định toàn mẫu 50 nền, và hai trường hợp biên (SIDS, Nhật Bản) — hội tụ về</w:t>
+        <w:t xml:space="preserve">Đọc dọc Bảng 5.1, toàn bộ mười nghiên cứu thành phần cùng chương sách bổ sung — nghiên cứu nền tảng 17 nền (P1), một phân tích tổng hợp toàn cầu (P6), năm ước lượng đơn quốc gia trải khắp phổ thể chế (P2–P5, P9), một kiểm định toàn mẫu 50 nền (P7), hai trường hợp biên (P8 SIDS, P10 Nhật Bản), và bằng chứng tầng quản trị từ chương sách — hội tụ về</w:t>
       </w:r>
       <w:r>
         <w:t xml:space="preserve"> </w:t>

</xml_diff>